<commit_message>
finished first two outputs, now turning to outputs for rse
</commit_message>
<xml_diff>
--- a/cudmore-narrative-cv/outputs/imaging-core/output_word/cv.docx
+++ b/cudmore-narrative-cv/outputs/imaging-core/output_word/cv.docx
@@ -42,7 +42,7 @@
         <w:pStyle w:val="FirstParagraph"/>
       </w:pPr>
       <w:r>
-        <w:t xml:space="preserve">My scientific domain expertise includes neuroscience, vascular biology, and cardiac physiology. I have decades of bench experience in experimental design, performing microscopy and electrophysiology experiments, interpreting results, and publishing the findings. I have also built custom microscopy and electrophysiology acquisition systems, developed software for real-time data acquisition and visualization, and supported researchers using these systems. My experimental experience informs the analysis software I develop. This background helps me work effectively with domain experts to build software that reflects the experiment and addresses the scientific question.</w:t>
+        <w:t xml:space="preserve">My scientific domain expertise includes neuroscience, vascular biology, and cardiac physiology. I have decades of bench experience in experimental design, performing microscopy and electrophysiology experiments, interpreting results, and publishing the findings. I have also built custom microscopy and electrophysiology acquisition systems, developed software for real-time data acquisition and visualization, and supported researchers using these systems. My experimental experience informs the analysis software I develop. It also gives me a practical foundation for collaborating in scientific domains beyond my own direct expertise. I work with domain experts to understand the experiment, identify scientifically valid measurements, and develop analysis software that addresses their questions.</w:t>
       </w:r>
     </w:p>
     <w:p>
@@ -54,7 +54,7 @@
       </w:r>
     </w:p>
     <w:bookmarkEnd w:id="10"/>
-    <w:bookmarkStart w:id="11" w:name="research-software-engineering"/>
+    <w:bookmarkStart w:id="15" w:name="research-software-engineering"/>
     <w:p>
       <w:pPr>
         <w:pStyle w:val="Heading2"/>
@@ -76,7 +76,41 @@
         <w:pStyle w:val="BodyText"/>
       </w:pPr>
       <w:r>
-        <w:t xml:space="preserve">I design analysis systems to support the full research workflow, from data acquisition through analysis and publication. During experiments, researchers can use a desktop application to visualize newly acquired data, run analyses, and inspect results. The same desktop application supports offline analysis and curation in the laboratory, including creating figures from the analysis results while preserving the connection between each result and its underlying raw data. For publication, a web-based viewer presents the same figure created during offline analysis together with its data and completed analyses. Individual results in the interactive web figure can be explored and traced back to the raw data from which they were derived.</w:t>
+        <w:t xml:space="preserve">I have implemented this design in</w:t>
+      </w:r>
+      <w:r>
+        <w:t xml:space="preserve"> </w:t>
+      </w:r>
+      <w:hyperlink r:id="rId11">
+        <w:r>
+          <w:rPr>
+            <w:rStyle w:val="Hyperlink"/>
+          </w:rPr>
+          <w:t xml:space="preserve">CloudScope</w:t>
+        </w:r>
+      </w:hyperlink>
+      <w:r>
+        <w:t xml:space="preserve"> </w:t>
+      </w:r>
+      <w:r>
+        <w:t xml:space="preserve">for imaging and</w:t>
+      </w:r>
+      <w:r>
+        <w:t xml:space="preserve"> </w:t>
+      </w:r>
+      <w:hyperlink r:id="rId12">
+        <w:r>
+          <w:rPr>
+            <w:rStyle w:val="Hyperlink"/>
+          </w:rPr>
+          <w:t xml:space="preserve">SanPy</w:t>
+        </w:r>
+      </w:hyperlink>
+      <w:r>
+        <w:t xml:space="preserve"> </w:t>
+      </w:r>
+      <w:r>
+        <w:t xml:space="preserve">for electrophysiology. During experiments, researchers use these desktop applications to visualize newly acquired data, run analyses, and inspect results. The same applications support offline analysis and curation in the laboratory, including creating figures while preserving the connection between each result and its underlying raw data. CloudScope, through AcqStore, saves raw images, analysis methods, detection parameters, and results in self-contained OME-Zarr datasets. SanPy saves raw electrophysiology recordings, metadata, detection parameters, and results in self-contained SanPy Zarr datasets.</w:t>
       </w:r>
     </w:p>
     <w:p>
@@ -84,11 +118,53 @@
         <w:pStyle w:val="BodyText"/>
       </w:pPr>
       <w:r>
-        <w:t xml:space="preserve">This continuous workflow keeps raw data, analysis, and publication connected while making scientific results easier to inspect, reproduce, and reuse. It also provides practical support for NIH Data Management and Sharing Plans by incorporating data organization, documentation of analysis methods and results, export, and repository preparation into the research workflow. Software alone cannot satisfy every policy or institutional requirement, but this design makes sharing well-described data and reproducible analyses a planned outcome rather than an additional task at the end of a project. Publishing an interactive figure that remains connected to the completed analysis and underlying raw data is a defining feature of my software design.</w:t>
-      </w:r>
-    </w:p>
-    <w:bookmarkEnd w:id="11"/>
-    <w:bookmarkStart w:id="12" w:name="X6e21c243095a355a744c385b632f33997655a0c"/>
+        <w:t xml:space="preserve">For publication,</w:t>
+      </w:r>
+      <w:r>
+        <w:t xml:space="preserve"> </w:t>
+      </w:r>
+      <w:hyperlink r:id="rId13">
+        <w:r>
+          <w:rPr>
+            <w:rStyle w:val="Hyperlink"/>
+          </w:rPr>
+          <w:t xml:space="preserve">CloudScope-Web</w:t>
+        </w:r>
+      </w:hyperlink>
+      <w:r>
+        <w:t xml:space="preserve"> </w:t>
+      </w:r>
+      <w:r>
+        <w:t xml:space="preserve">and</w:t>
+      </w:r>
+      <w:r>
+        <w:t xml:space="preserve"> </w:t>
+      </w:r>
+      <w:hyperlink r:id="rId14">
+        <w:r>
+          <w:rPr>
+            <w:rStyle w:val="Hyperlink"/>
+          </w:rPr>
+          <w:t xml:space="preserve">SanPy-Web</w:t>
+        </w:r>
+      </w:hyperlink>
+      <w:r>
+        <w:t xml:space="preserve"> </w:t>
+      </w:r>
+      <w:r>
+        <w:t xml:space="preserve">open these saved datasets as interactive published figures on the web. The figures remain connected to their raw data and completed analyses, allowing individual results to be explored and traced back to the data from which they were derived.</w:t>
+      </w:r>
+    </w:p>
+    <w:p>
+      <w:pPr>
+        <w:pStyle w:val="BodyText"/>
+      </w:pPr>
+      <w:r>
+        <w:t xml:space="preserve">This continuous workflow keeps raw data, analysis, and publication connected while making scientific results easier to inspect, reproduce, and reuse. It also provides practical support for NIH Data Management and Sharing Plans by incorporating data organization, documentation of analysis methods and results, export, and repository preparation into the research workflow. Software alone cannot satisfy every policy or institutional requirement, but this design makes sharing annotated data and reproducible analyses a planned outcome rather than an additional task at the end of a project. Publishing an interactive figure that remains connected to the completed analysis and underlying raw data is a defining feature of my software design.</w:t>
+      </w:r>
+    </w:p>
+    <w:bookmarkEnd w:id="15"/>
+    <w:bookmarkStart w:id="16" w:name="X6e21c243095a355a744c385b632f33997655a0c"/>
     <w:p>
       <w:pPr>
         <w:pStyle w:val="Heading2"/>
@@ -110,6 +186,14 @@
         <w:pStyle w:val="BodyText"/>
       </w:pPr>
       <w:r>
+        <w:t xml:space="preserve">Imaging cores already provide established commercial software for instrument control, visualization, and general-purpose analysis. My goal is not to replace these platforms, but to complement them when projects require specialized methods, automation across datasets, or a reproducible path from analysis to publication and sharing. An analysis core could use commercial tools where they meet the scientific need, then develop custom adapters and open-source pipelines as new requirements emerge. This approach would preserve existing investments while connecting raw data and completed analyses with open repositories and interactive publication.</w:t>
+      </w:r>
+    </w:p>
+    <w:p>
+      <w:pPr>
+        <w:pStyle w:val="BodyText"/>
+      </w:pPr>
+      <w:r>
         <w:t xml:space="preserve">I would develop this capability within an existing imaging facility, academic department, or research organization rather than requiring the immediate creation of a separate administrative core. It could begin with direct researcher support, training, and reusable analysis software, then grow according to the needs of the institution and its laboratories.</w:t>
       </w:r>
     </w:p>
@@ -121,8 +205,8 @@
         <w:t xml:space="preserve">An analysis core would connect experimental design and acquisition with quantitative analysis, publication, and data sharing. It could incorporate data organization, analysis, export, and repository preparation into the research workflow. Integrating these activities would reduce duplicated effort across laboratories and provide continuity as projects and personnel change. The analysis core would also help researchers prepare well-described data and reproducible analyses for domain-appropriate repositories such as the DANDI Archive and the Brain Image Library (BIL).</w:t>
       </w:r>
     </w:p>
-    <w:bookmarkEnd w:id="12"/>
-    <w:bookmarkStart w:id="13" w:name="Xb54d8219c1f7a3b6c9a46989e8329636ac3d6d9"/>
+    <w:bookmarkEnd w:id="16"/>
+    <w:bookmarkStart w:id="17" w:name="Xb54d8219c1f7a3b6c9a46989e8329636ac3d6d9"/>
     <w:p>
       <w:pPr>
         <w:pStyle w:val="Heading2"/>
@@ -155,7 +239,7 @@
         <w:t xml:space="preserve">I enjoy working directly with researchers on the practical problems that arise during data acquisition and analysis. These interactions help researchers develop confidence with quantitative and reproducible methods while revealing recurring needs that can be addressed through improved documentation, training, and reusable software shared across laboratories.</w:t>
       </w:r>
     </w:p>
-    <w:bookmarkEnd w:id="13"/>
+    <w:bookmarkEnd w:id="17"/>
     <w:sectPr>
       <w:type w:val="nextPage"/>
       <w:pgSz w:h="15840" w:w="12240"/>
@@ -736,7 +820,7 @@
   </w:style>
   <w:style w:styleId="Heading3" w:type="paragraph">
     <w:name w:val="heading 3"/>
-    <w:basedOn w:val="Normal"/>
+    <w:basedOn w:val="Heading2"/>
     <w:next w:val="Normal"/>
     <w:link w:val="Heading3Char"/>
     <w:uiPriority w:val="9"/>
@@ -752,9 +836,7 @@
     </w:pPr>
     <w:rPr>
       <w:rFonts w:cs="" w:cstheme="majorBidi" w:eastAsia="" w:eastAsiaTheme="majorEastAsia"/>
-      <w:color w:themeColor="accent1" w:themeShade="bf" w:val="0F4761"/>
-      <w:sz w:val="28"/>
-      <w:szCs w:val="28"/>
+      <w:u w:val="none"/>
     </w:rPr>
   </w:style>
   <w:style w:styleId="Heading4" w:type="paragraph">

</xml_diff>